<commit_message>
court(iowactapp): reply brief latex gated on the model's hard line break (fb-595.54.75)
Co-Authored-By: Claude Opus 5.5 <noreply@anthropic.com>
</commit_message>
<xml_diff>
--- a/courts/eighth-circuit/iowa/state/court-of-appeals/reply-brief/usage/OUTPUT-reply-brief.docx
+++ b/courts/eighth-circuit/iowa/state/court-of-appeals/reply-brief/usage/OUTPUT-reply-brief.docx
@@ -6312,7 +6312,7 @@
         <w:t xml:space="preserve"> </w:t>
       </w:r>
       <w:r>
-        <w:t xml:space="preserve">“into workers’ compensation law” and rejecting many constitutional challenges); Iowa Code § 17A.6(2)-(3)</w:t>
+        <w:t xml:space="preserve">“into workers’ compensation law” and rejecting many constitutional challenges); Iowa Code § 17A.6(2)-⁠(3)</w:t>
       </w:r>
       <w:r>
         <w:t xml:space="preserve"> </w:t>
@@ -6935,7 +6935,7 @@
         <w:pStyle w:val="XdTail"/>
       </w:pPr>
       <w:r>
-        <w:t xml:space="preserve">[ ] this brief uses a monospaced typeface and contains [state the number of] lines of text, excluding the parts of the brief exempted by Iowa. R. App. P. 6.903(1)⁠(g)⁠(2).</w:t>
+        <w:t xml:space="preserve">[ ] this brief uses a monospaced typeface and contains [state the number of] lines of text, excluding the parts of the brief exempted by Iowa. R. App. P. 6.903(1)⁠(g)⁠(2).</w:t>
       </w:r>
     </w:p>
     <w:p>
@@ -6959,7 +6959,7 @@
         <w:pStyle w:val="XdTail"/>
       </w:pPr>
       <w:r>
-        <w:t xml:space="preserve">[ ] this brief has been prepared in a monospaced typeface using [state name and version of word processing program] with [state number of characters per inch and name of type style].</w:t>
+        <w:t xml:space="preserve">[ ] this brief has been prepared in a monospaced typeface using [state name and version of word processing program] with [state number of characters per inch and name of type style].</w:t>
       </w:r>
     </w:p>
     <w:p>
@@ -7981,6 +7981,7 @@
     <w:unhideWhenUsed/>
     <w:qFormat/>
     <w:pPr>
+      <w:keepLines/>
       <w:spacing w:before="0" w:after="140" w:line="322" w:lineRule="exact"/>
     </w:pPr>
     <w:rPr>
@@ -8231,6 +8232,33 @@
     <w:pPr>
       <w:spacing w:before="0" w:after="0" w:line="644" w:lineRule="exact"/>
       <w:ind w:left="2160" w:hanging="720"/>
+    </w:pPr>
+  </w:style>
+  <w:style w:type="paragraph" w:customStyle="1" w:styleId="XdQuoteList1">
+    <w:name w:val="Xd Quote List 1"/>
+    <w:basedOn w:val="Normal"/>
+    <w:qFormat/>
+    <w:pPr>
+      <w:spacing w:before="0" w:after="0" w:line="322" w:lineRule="exact"/>
+      <w:ind w:left="1440" w:right="720" w:hanging="720"/>
+    </w:pPr>
+  </w:style>
+  <w:style w:type="paragraph" w:customStyle="1" w:styleId="XdQuoteList2">
+    <w:name w:val="Xd Quote List 2"/>
+    <w:basedOn w:val="Normal"/>
+    <w:qFormat/>
+    <w:pPr>
+      <w:spacing w:before="0" w:after="0" w:line="322" w:lineRule="exact"/>
+      <w:ind w:left="2160" w:right="720" w:hanging="720"/>
+    </w:pPr>
+  </w:style>
+  <w:style w:type="paragraph" w:customStyle="1" w:styleId="XdQuoteList3">
+    <w:name w:val="Xd Quote List 3"/>
+    <w:basedOn w:val="Normal"/>
+    <w:qFormat/>
+    <w:pPr>
+      <w:spacing w:before="0" w:after="0" w:line="322" w:lineRule="exact"/>
+      <w:ind w:left="2880" w:right="720" w:hanging="720"/>
     </w:pPr>
   </w:style>
   <w:style w:type="paragraph" w:customStyle="1" w:styleId="XdQuote">

</xml_diff>